<commit_message>
Tweaked word doc support and added pdf support
</commit_message>
<xml_diff>
--- a/trial_calendar_template.docx
+++ b/trial_calendar_template.docx
@@ -45,35 +45,7 @@
           <w:b/>
           <w:sz w:val="48"/>
         </w:rPr>
-        <w:t>00</w:t>
-      </w:r>
-      <w:r>
-        <w:rPr>
-          <w:b/>
-          <w:sz w:val="48"/>
-        </w:rPr>
-        <w:t>/</w:t>
-      </w:r>
-      <w:r>
-        <w:rPr>
-          <w:b/>
-          <w:sz w:val="48"/>
-        </w:rPr>
-        <w:t>00</w:t>
-      </w:r>
-      <w:r>
-        <w:rPr>
-          <w:b/>
-          <w:sz w:val="48"/>
-        </w:rPr>
-        <w:t>/</w:t>
-      </w:r>
-      <w:r>
-        <w:rPr>
-          <w:b/>
-          <w:sz w:val="48"/>
-        </w:rPr>
-        <w:t>00</w:t>
+        <w:t>{TRIAL}</w:t>
       </w:r>
     </w:p>
     <w:p/>
@@ -196,6 +168,13 @@
                 <w:rFonts w:ascii="Cambria" w:hAnsi="Cambria"/>
                 <w:b/>
               </w:rPr>
+              <w:t>{CASE_NO}</w:t>
+            </w:r>
+            <w:r>
+              <w:rPr>
+                <w:rFonts w:ascii="Cambria" w:hAnsi="Cambria"/>
+                <w:b/>
+              </w:rPr>
               <w:fldChar w:fldCharType="begin"/>
             </w:r>
             <w:r>
@@ -409,29 +388,27 @@
               </w:rPr>
               <w:t xml:space="preserve">DATE:       </w:t>
             </w:r>
-          </w:p>
-          <w:p>
-            <w:pPr>
-              <w:rPr>
-                <w:rFonts w:ascii="Cambria" w:hAnsi="Cambria"/>
-                <w:b/>
-              </w:rPr>
-            </w:pPr>
-            <w:proofErr w:type="gramStart"/>
-            <w:r>
-              <w:rPr>
-                <w:rFonts w:ascii="Cambria" w:hAnsi="Cambria"/>
-                <w:b/>
-              </w:rPr>
-              <w:t>TIME:.</w:t>
-            </w:r>
-            <w:proofErr w:type="gramEnd"/>
-            <w:r>
-              <w:rPr>
-                <w:rFonts w:ascii="Cambria" w:hAnsi="Cambria"/>
-                <w:b/>
-              </w:rPr>
-              <w:t xml:space="preserve">       </w:t>
+            <w:r>
+              <w:rPr>
+                <w:rFonts w:ascii="Cambria" w:hAnsi="Cambria"/>
+                <w:b/>
+              </w:rPr>
+              <w:t>{TRIAL_DATE}</w:t>
+            </w:r>
+          </w:p>
+          <w:p>
+            <w:pPr>
+              <w:rPr>
+                <w:rFonts w:ascii="Cambria" w:hAnsi="Cambria"/>
+                <w:b/>
+              </w:rPr>
+            </w:pPr>
+            <w:r>
+              <w:rPr>
+                <w:rFonts w:ascii="Cambria" w:hAnsi="Cambria"/>
+                <w:b/>
+              </w:rPr>
+              <w:t xml:space="preserve">TIME:.       </w:t>
             </w:r>
           </w:p>
           <w:p>
@@ -528,6 +505,13 @@
                 <w:rFonts w:ascii="Cambria" w:hAnsi="Cambria"/>
                 <w:b/>
               </w:rPr>
+              <w:t>{MSC_DATE}</w:t>
+            </w:r>
+            <w:r>
+              <w:rPr>
+                <w:rFonts w:ascii="Cambria" w:hAnsi="Cambria"/>
+                <w:b/>
+              </w:rPr>
               <w:fldChar w:fldCharType="begin"/>
             </w:r>
             <w:r>
@@ -727,44 +711,8 @@
               <w:rPr>
                 <w:rFonts w:ascii="Cambria" w:hAnsi="Cambria"/>
               </w:rPr>
-              <w:t xml:space="preserve"> [</w:t>
-            </w:r>
-            <w:proofErr w:type="gramStart"/>
-            <w:r>
-              <w:rPr>
-                <w:rFonts w:ascii="Cambria" w:hAnsi="Cambria"/>
-              </w:rPr>
-              <w:t>Usually</w:t>
-            </w:r>
-            <w:proofErr w:type="gramEnd"/>
-            <w:r>
-              <w:rPr>
-                <w:rFonts w:ascii="Cambria" w:hAnsi="Cambria"/>
-              </w:rPr>
-              <w:t xml:space="preserve"> 5 court days before Issue </w:t>
-            </w:r>
-            <w:proofErr w:type="gramStart"/>
-            <w:r>
-              <w:rPr>
-                <w:rFonts w:ascii="Cambria" w:hAnsi="Cambria"/>
-              </w:rPr>
-              <w:t>conference](</w:t>
-            </w:r>
-            <w:proofErr w:type="gramEnd"/>
-            <w:r>
-              <w:rPr>
-                <w:rFonts w:ascii="Cambria" w:hAnsi="Cambria"/>
-              </w:rPr>
-              <w:t xml:space="preserve">See </w:t>
-            </w:r>
-            <w:proofErr w:type="gramStart"/>
-            <w:r>
-              <w:rPr>
-                <w:rFonts w:ascii="Cambria" w:hAnsi="Cambria"/>
-              </w:rPr>
-              <w:t xml:space="preserve">attached)   </w:t>
-            </w:r>
-            <w:proofErr w:type="gramEnd"/>
+              <w:t xml:space="preserve"> [Usually 5 court days before Issue conference](See attached)   </w:t>
+            </w:r>
           </w:p>
         </w:tc>
         <w:tc>
@@ -792,7 +740,7 @@
                 <w:b/>
                 <w:bCs/>
               </w:rPr>
-              <w:t>Date0</w:t>
+              <w:t>{DATE_0}</w:t>
             </w:r>
           </w:p>
         </w:tc>
@@ -868,7 +816,7 @@
                 <w:b/>
                 <w:bCs/>
               </w:rPr>
-              <w:t>Date1</w:t>
+              <w:t>{DATE_1}</w:t>
             </w:r>
           </w:p>
         </w:tc>
@@ -969,7 +917,7 @@
                 <w:rFonts w:ascii="Cambria" w:hAnsi="Cambria"/>
                 <w:b/>
               </w:rPr>
-              <w:t>Date2</w:t>
+              <w:t>{DATE_2}</w:t>
             </w:r>
           </w:p>
           <w:p>
@@ -991,7 +939,7 @@
                 <w:rFonts w:ascii="Cambria" w:hAnsi="Cambria"/>
                 <w:b/>
               </w:rPr>
-              <w:t>Date3</w:t>
+              <w:t>{DATE_3}</w:t>
             </w:r>
           </w:p>
         </w:tc>
@@ -1114,7 +1062,7 @@
                 <w:rFonts w:ascii="Cambria" w:hAnsi="Cambria"/>
                 <w:b/>
               </w:rPr>
-              <w:t>Date4</w:t>
+              <w:t>{DATE_4}</w:t>
             </w:r>
           </w:p>
           <w:p>
@@ -1143,7 +1091,7 @@
                 <w:rFonts w:ascii="Cambria" w:hAnsi="Cambria"/>
                 <w:b/>
               </w:rPr>
-              <w:t>Date5</w:t>
+              <w:t>{DATE_5}</w:t>
             </w:r>
           </w:p>
           <w:p>
@@ -1165,7 +1113,7 @@
                 <w:rFonts w:ascii="Cambria" w:hAnsi="Cambria"/>
                 <w:b/>
               </w:rPr>
-              <w:t>Date6</w:t>
+              <w:t>{DATE_6}</w:t>
             </w:r>
           </w:p>
         </w:tc>
@@ -1234,7 +1182,7 @@
                 <w:rFonts w:ascii="Cambria" w:hAnsi="Cambria"/>
                 <w:b/>
               </w:rPr>
-              <w:t>Date7</w:t>
+              <w:t>{DATE_7}</w:t>
             </w:r>
           </w:p>
         </w:tc>
@@ -1290,7 +1238,7 @@
                 <w:rFonts w:ascii="Cambria" w:hAnsi="Cambria"/>
                 <w:b/>
               </w:rPr>
-              <w:t>Date8</w:t>
+              <w:t>{DATE_8}</w:t>
             </w:r>
           </w:p>
         </w:tc>
@@ -1386,7 +1334,7 @@
                 <w:rFonts w:ascii="Cambria" w:hAnsi="Cambria"/>
                 <w:b/>
               </w:rPr>
-              <w:t>Date9</w:t>
+              <w:t>{DATE_9}</w:t>
             </w:r>
           </w:p>
           <w:p>
@@ -1408,7 +1356,7 @@
                 <w:rFonts w:ascii="Cambria" w:hAnsi="Cambria"/>
                 <w:b/>
               </w:rPr>
-              <w:t>Date10</w:t>
+              <w:t>{DATE_10}</w:t>
             </w:r>
           </w:p>
         </w:tc>
@@ -1503,7 +1451,7 @@
                 <w:rFonts w:ascii="Cambria" w:hAnsi="Cambria"/>
                 <w:b/>
               </w:rPr>
-              <w:t>Date11</w:t>
+              <w:t>{DATE_11}</w:t>
             </w:r>
           </w:p>
           <w:p>
@@ -1525,7 +1473,7 @@
                 <w:rFonts w:ascii="Cambria" w:hAnsi="Cambria"/>
                 <w:b/>
               </w:rPr>
-              <w:t>Date12</w:t>
+              <w:t>{DATE_12}</w:t>
             </w:r>
           </w:p>
         </w:tc>
@@ -1612,7 +1560,7 @@
                 <w:rFonts w:ascii="Cambria" w:hAnsi="Cambria"/>
                 <w:b/>
               </w:rPr>
-              <w:t>Date13</w:t>
+              <w:t>{DATE_13}</w:t>
             </w:r>
           </w:p>
         </w:tc>
@@ -1687,7 +1635,7 @@
                 <w:rFonts w:ascii="Cambria" w:hAnsi="Cambria"/>
                 <w:b/>
               </w:rPr>
-              <w:t>Date14</w:t>
+              <w:t>{DATE_14}</w:t>
             </w:r>
           </w:p>
         </w:tc>
@@ -1781,7 +1729,7 @@
                 <w:rFonts w:ascii="Cambria" w:hAnsi="Cambria"/>
                 <w:b/>
               </w:rPr>
-              <w:t>Date15</w:t>
+              <w:t>{DATE_15}</w:t>
             </w:r>
           </w:p>
         </w:tc>
@@ -1891,7 +1839,7 @@
                 <w:rFonts w:ascii="Cambria" w:hAnsi="Cambria"/>
                 <w:b/>
               </w:rPr>
-              <w:t>Date16</w:t>
+              <w:t>{DATE_16}</w:t>
             </w:r>
           </w:p>
           <w:p>
@@ -1913,7 +1861,7 @@
                 <w:rFonts w:ascii="Cambria" w:hAnsi="Cambria"/>
                 <w:b/>
               </w:rPr>
-              <w:t>Date17</w:t>
+              <w:t>{DATE_17}</w:t>
             </w:r>
           </w:p>
           <w:p>
@@ -1950,14 +1898,7 @@
                 <w:rFonts w:ascii="Cambria" w:hAnsi="Cambria"/>
                 <w:b/>
               </w:rPr>
-              <w:t>Date1</w:t>
-            </w:r>
-            <w:r>
-              <w:rPr>
-                <w:rFonts w:ascii="Cambria" w:hAnsi="Cambria"/>
-                <w:b/>
-              </w:rPr>
-              <w:t>8</w:t>
+              <w:t>{DATE_18}</w:t>
             </w:r>
           </w:p>
           <w:p>
@@ -1979,14 +1920,7 @@
                 <w:rFonts w:ascii="Cambria" w:hAnsi="Cambria"/>
                 <w:b/>
               </w:rPr>
-              <w:t>Date1</w:t>
-            </w:r>
-            <w:r>
-              <w:rPr>
-                <w:rFonts w:ascii="Cambria" w:hAnsi="Cambria"/>
-                <w:b/>
-              </w:rPr>
-              <w:t>9</w:t>
+              <w:t>{DATE_19}</w:t>
             </w:r>
           </w:p>
         </w:tc>
@@ -2055,14 +1989,7 @@
                 <w:rFonts w:ascii="Cambria" w:hAnsi="Cambria"/>
                 <w:b/>
               </w:rPr>
-              <w:t>Date</w:t>
-            </w:r>
-            <w:r>
-              <w:rPr>
-                <w:rFonts w:ascii="Cambria" w:hAnsi="Cambria"/>
-                <w:b/>
-              </w:rPr>
-              <w:t>20</w:t>
+              <w:t>{DATE_20}</w:t>
             </w:r>
           </w:p>
         </w:tc>
@@ -2131,14 +2058,7 @@
                 <w:rFonts w:ascii="Cambria" w:hAnsi="Cambria"/>
                 <w:b/>
               </w:rPr>
-              <w:t>Date2</w:t>
-            </w:r>
-            <w:r>
-              <w:rPr>
-                <w:rFonts w:ascii="Cambria" w:hAnsi="Cambria"/>
-                <w:b/>
-              </w:rPr>
-              <w:t>1</w:t>
+              <w:t>{DATE_21}</w:t>
             </w:r>
           </w:p>
         </w:tc>
@@ -2208,7 +2128,7 @@
                 <w:rFonts w:ascii="Cambria" w:hAnsi="Cambria"/>
                 <w:b/>
               </w:rPr>
-              <w:t>Date22</w:t>
+              <w:t>{DATE_22}</w:t>
             </w:r>
           </w:p>
         </w:tc>

</xml_diff>

<commit_message>
update msc inclusion and pdf production logic
</commit_message>
<xml_diff>
--- a/trial_calendar_template.docx
+++ b/trial_calendar_template.docx
@@ -168,7 +168,21 @@
                 <w:rFonts w:ascii="Cambria" w:hAnsi="Cambria"/>
                 <w:b/>
               </w:rPr>
-              <w:t>{CASE_NO}</w:t>
+              <w:t>{</w:t>
+            </w:r>
+            <w:r>
+              <w:rPr>
+                <w:rFonts w:ascii="Cambria" w:hAnsi="Cambria"/>
+                <w:b/>
+              </w:rPr>
+              <w:t>FILE</w:t>
+            </w:r>
+            <w:r>
+              <w:rPr>
+                <w:rFonts w:ascii="Cambria" w:hAnsi="Cambria"/>
+                <w:b/>
+              </w:rPr>
+              <w:t>_NO}</w:t>
             </w:r>
             <w:r>
               <w:rPr>

</xml_diff>

<commit_message>
Streamline date logic with due_date class
</commit_message>
<xml_diff>
--- a/trial_calendar_template.docx
+++ b/trial_calendar_template.docx
@@ -885,37 +885,7 @@
               <w:rPr>
                 <w:rFonts w:ascii="Cambria" w:hAnsi="Cambria"/>
               </w:rPr>
-              <w:t>(</w:t>
-            </w:r>
-            <w:r>
-              <w:rPr>
-                <w:rFonts w:ascii="Cambria" w:hAnsi="Cambria"/>
-              </w:rPr>
-              <w:t>via</w:t>
-            </w:r>
-            <w:r>
-              <w:rPr>
-                <w:rFonts w:ascii="Cambria" w:hAnsi="Cambria"/>
-              </w:rPr>
-              <w:t xml:space="preserve"> hand delivery</w:t>
-            </w:r>
-            <w:r>
-              <w:rPr>
-                <w:rFonts w:ascii="Cambria" w:hAnsi="Cambria"/>
-              </w:rPr>
-              <w:t xml:space="preserve"> - 30 days prior (push to Friday if weekend) + 8</w:t>
-            </w:r>
-            <w:r>
-              <w:rPr>
-                <w:rFonts w:ascii="Cambria" w:hAnsi="Cambria"/>
-              </w:rPr>
-              <w:t>1</w:t>
-            </w:r>
-            <w:r>
-              <w:rPr>
-                <w:rFonts w:ascii="Cambria" w:hAnsi="Cambria"/>
-              </w:rPr>
-              <w:t xml:space="preserve"> days)</w:t>
+              <w:t>(via hand delivery - 30 days prior (push to Friday if weekend) + 81 days)</w:t>
             </w:r>
           </w:p>
         </w:tc>
@@ -1235,7 +1205,7 @@
             <w:pPr>
               <w:rPr>
                 <w:rFonts w:ascii="Cambria" w:hAnsi="Cambria"/>
-                <w:b/>
+                <w:bCs/>
               </w:rPr>
             </w:pPr>
             <w:r>
@@ -1244,6 +1214,20 @@
                 <w:b/>
               </w:rPr>
               <w:t>LD TO EXCHANGE EXPERT WITNESS</w:t>
+            </w:r>
+            <w:r>
+              <w:rPr>
+                <w:rFonts w:ascii="Cambria" w:hAnsi="Cambria"/>
+                <w:b/>
+              </w:rPr>
+              <w:t xml:space="preserve"> </w:t>
+            </w:r>
+            <w:r>
+              <w:rPr>
+                <w:rFonts w:ascii="Cambria" w:hAnsi="Cambria"/>
+                <w:bCs/>
+              </w:rPr>
+              <w:t>(50 days prior)</w:t>
             </w:r>
           </w:p>
         </w:tc>

</xml_diff>